<commit_message>
Alterações no documento e no código
</commit_message>
<xml_diff>
--- a/doc/technical_report.docx
+++ b/doc/technical_report.docx
@@ -85,7 +85,13 @@
         <w:pStyle w:val="Ttulo"/>
       </w:pPr>
       <w:r>
-        <w:t>YASMIN ARAÚJO ARANTES</w:t>
+        <w:t>YASMIN</w:t>
+      </w:r>
+      <w:r>
+        <w:t xml:space="preserve"> DE </w:t>
+      </w:r>
+      <w:r>
+        <w:t>ARAÚJO ARANTES</w:t>
       </w:r>
     </w:p>
     <w:p>
@@ -154,7 +160,16 @@
           <w:sz w:val="32"/>
           <w:szCs w:val="32"/>
         </w:rPr>
-        <w:t>SISTEMAS PARA GERENCIAMENTO E EXECUÇÃO DE CASOS DE TESTE PARA ÁREA MILITAR</w:t>
+        <w:t xml:space="preserve">SISTEMAS PARA GERENCIAMENTO E EXECUÇÃO DE CASOS DE TESTE PARA </w:t>
+      </w:r>
+      <w:r>
+        <w:rPr>
+          <w:b/>
+          <w:bCs/>
+          <w:sz w:val="32"/>
+          <w:szCs w:val="32"/>
+        </w:rPr>
+        <w:t>SISTEMAS WEB</w:t>
       </w:r>
     </w:p>
     <w:p>
@@ -1273,7 +1288,22 @@
     <w:p>
       <w:bookmarkStart w:id="5" w:name="_Toc49841025"/>
       <w:r>
-        <w:t>Os sistemas militares possuem uma abrangência nacional e tem o compromisso de trabalhar pelo bem da nação. Sendo assim, os testes a serem realizados nesse sistema são de extrema importância para garantir o sigilo, a confiabilidade e a disponibilidade das informações dispostas.</w:t>
+        <w:t xml:space="preserve">Os sistemas </w:t>
+      </w:r>
+      <w:r>
+        <w:t>web são soluções que podem ser desenvolvidas para torna</w:t>
+      </w:r>
+      <w:r>
+        <w:t>r</w:t>
+      </w:r>
+      <w:r>
+        <w:t xml:space="preserve"> processos manuais mais simples, rápidos e eficazes. Os sistemas também podem ser elaborados como forma de integrar a comunicação e permitir que determinados públicos tenham acessos as informações</w:t>
+      </w:r>
+      <w:r>
+        <w:t>, sendo eles personalizados de acordo com a necessidade do cliente</w:t>
+      </w:r>
+      <w:r>
+        <w:t xml:space="preserve">. </w:t>
       </w:r>
     </w:p>
     <w:p>
@@ -1292,7 +1322,7 @@
     </w:p>
     <w:p>
       <w:r>
-        <w:t xml:space="preserve">O objetivo deste projeto é utilizar uma interface web em conjunto com ferramentas tais como o selenium webdriver para automatizar diversas categorias de teste para sistemas militares. </w:t>
+        <w:t xml:space="preserve">O objetivo deste projeto é utilizar uma interface web em conjunto com ferramentas tais como o selenium webdriver para automatizar diversas categorias de teste. </w:t>
       </w:r>
     </w:p>
     <w:p>
@@ -1377,7 +1407,13 @@
         <w:ind w:left="1134" w:hanging="283"/>
       </w:pPr>
       <w:r>
-        <w:t>Java SE 8</w:t>
+        <w:t xml:space="preserve">Java </w:t>
+      </w:r>
+      <w:r>
+        <w:t>E</w:t>
+      </w:r>
+      <w:r>
+        <w:t>E 8</w:t>
       </w:r>
     </w:p>
     <w:p>
@@ -1832,17 +1868,17 @@
         <v:path o:extrusionok="f" gradientshapeok="t" o:connecttype="rect"/>
         <o:lock v:ext="edit" aspectratio="t"/>
       </v:shapetype>
-      <v:shape id="_x0000_i1122" type="#_x0000_t75" style="width:3in;height:3in" o:bullet="t"/>
+      <v:shape id="_x0000_i1062" type="#_x0000_t75" style="width:3in;height:3in" o:bullet="t"/>
     </w:pict>
   </w:numPicBullet>
   <w:numPicBullet w:numPicBulletId="1">
     <w:pict>
-      <v:shape id="_x0000_i1123" type="#_x0000_t75" style="width:3in;height:3in" o:bullet="t"/>
+      <v:shape id="_x0000_i1063" type="#_x0000_t75" style="width:3in;height:3in" o:bullet="t"/>
     </w:pict>
   </w:numPicBullet>
   <w:numPicBullet w:numPicBulletId="2">
     <w:pict>
-      <v:shape id="_x0000_i1124" type="#_x0000_t75" style="width:3in;height:3in" o:bullet="t"/>
+      <v:shape id="_x0000_i1064" type="#_x0000_t75" style="width:3in;height:3in" o:bullet="t"/>
     </w:pict>
   </w:numPicBullet>
   <w:abstractNum w:abstractNumId="0" w15:restartNumberingAfterBreak="0">

</xml_diff>

<commit_message>
Revisão no doc do TG - Introdução. Alteração de estrutura e reescrita de parágrafos. Vide itens marcados em amarelo
</commit_message>
<xml_diff>
--- a/doc/technical_report.docx
+++ b/doc/technical_report.docx
@@ -159,17 +159,9 @@
           <w:bCs/>
           <w:sz w:val="32"/>
           <w:szCs w:val="32"/>
-        </w:rPr>
-        <w:t xml:space="preserve">SISTEMAS PARA GERENCIAMENTO E EXECUÇÃO DE CASOS DE TESTE PARA </w:t>
-      </w:r>
-      <w:r>
-        <w:rPr>
-          <w:b/>
-          <w:bCs/>
-          <w:sz w:val="32"/>
-          <w:szCs w:val="32"/>
-        </w:rPr>
-        <w:t>SISTEMAS WEB</w:t>
+          <w:highlight w:val="yellow"/>
+        </w:rPr>
+        <w:t>SISTEMA WEB PARA GERENCIAMENTO E EXECUÇÃO DE CASOS DE TESTE</w:t>
       </w:r>
     </w:p>
     <w:p>
@@ -288,7 +280,21 @@
         <w:rPr>
           <w:szCs w:val="24"/>
         </w:rPr>
-        <w:t>Fabrício Galende Marques de Carvalho</w:t>
+        <w:t xml:space="preserve">Fabrício </w:t>
+      </w:r>
+      <w:proofErr w:type="spellStart"/>
+      <w:r>
+        <w:rPr>
+          <w:szCs w:val="24"/>
+        </w:rPr>
+        <w:t>Galende</w:t>
+      </w:r>
+      <w:proofErr w:type="spellEnd"/>
+      <w:r>
+        <w:rPr>
+          <w:szCs w:val="24"/>
+        </w:rPr>
+        <w:t xml:space="preserve"> Marques de Carvalho</w:t>
       </w:r>
     </w:p>
     <w:p>
@@ -449,7 +455,7 @@
         </w:rPr>
         <w:fldChar w:fldCharType="separate"/>
       </w:r>
-      <w:hyperlink w:anchor="_Toc49841023" w:history="1">
+      <w:hyperlink w:anchor="_Toc52574812" w:history="1">
         <w:r>
           <w:rPr>
             <w:rStyle w:val="Hyperlink"/>
@@ -492,7 +498,7 @@
             <w:noProof/>
             <w:webHidden/>
           </w:rPr>
-          <w:instrText xml:space="preserve"> PAGEREF _Toc49841023 \h </w:instrText>
+          <w:instrText xml:space="preserve"> PAGEREF _Toc52574812 \h </w:instrText>
         </w:r>
         <w:r>
           <w:rPr>
@@ -537,7 +543,7 @@
           <w:szCs w:val="22"/>
         </w:rPr>
       </w:pPr>
-      <w:hyperlink w:anchor="_Toc49841024" w:history="1">
+      <w:hyperlink w:anchor="_Toc52574813" w:history="1">
         <w:r>
           <w:rPr>
             <w:rStyle w:val="Hyperlink"/>
@@ -580,7 +586,7 @@
             <w:noProof/>
             <w:webHidden/>
           </w:rPr>
-          <w:instrText xml:space="preserve"> PAGEREF _Toc49841024 \h </w:instrText>
+          <w:instrText xml:space="preserve"> PAGEREF _Toc52574813 \h </w:instrText>
         </w:r>
         <w:r>
           <w:rPr>
@@ -625,7 +631,7 @@
           <w:szCs w:val="22"/>
         </w:rPr>
       </w:pPr>
-      <w:hyperlink w:anchor="_Toc49841025" w:history="1">
+      <w:hyperlink w:anchor="_Toc52574814" w:history="1">
         <w:r>
           <w:rPr>
             <w:rStyle w:val="Hyperlink"/>
@@ -668,7 +674,7 @@
             <w:noProof/>
             <w:webHidden/>
           </w:rPr>
-          <w:instrText xml:space="preserve"> PAGEREF _Toc49841025 \h </w:instrText>
+          <w:instrText xml:space="preserve"> PAGEREF _Toc52574814 \h </w:instrText>
         </w:r>
         <w:r>
           <w:rPr>
@@ -713,7 +719,7 @@
           <w:szCs w:val="22"/>
         </w:rPr>
       </w:pPr>
-      <w:hyperlink w:anchor="_Toc49841026" w:history="1">
+      <w:hyperlink w:anchor="_Toc52574815" w:history="1">
         <w:r>
           <w:rPr>
             <w:rStyle w:val="Hyperlink"/>
@@ -756,7 +762,7 @@
             <w:noProof/>
             <w:webHidden/>
           </w:rPr>
-          <w:instrText xml:space="preserve"> PAGEREF _Toc49841026 \h </w:instrText>
+          <w:instrText xml:space="preserve"> PAGEREF _Toc52574815 \h </w:instrText>
         </w:r>
         <w:r>
           <w:rPr>
@@ -776,91 +782,7 @@
             <w:noProof/>
             <w:webHidden/>
           </w:rPr>
-          <w:t>3</w:t>
-        </w:r>
-        <w:r>
-          <w:rPr>
-            <w:noProof/>
-            <w:webHidden/>
-          </w:rPr>
-          <w:fldChar w:fldCharType="end"/>
-        </w:r>
-      </w:hyperlink>
-    </w:p>
-    <w:p>
-      <w:pPr>
-        <w:pStyle w:val="Sumrio1"/>
-        <w:rPr>
-          <w:rFonts w:asciiTheme="minorHAnsi" w:eastAsiaTheme="minorEastAsia" w:hAnsiTheme="minorHAnsi" w:cstheme="minorBidi"/>
-          <w:noProof/>
-          <w:sz w:val="22"/>
-          <w:szCs w:val="22"/>
-        </w:rPr>
-      </w:pPr>
-      <w:hyperlink w:anchor="_Toc49841027" w:history="1">
-        <w:r>
-          <w:rPr>
-            <w:rStyle w:val="Hyperlink"/>
-            <w:noProof/>
-          </w:rPr>
-          <w:t>2</w:t>
-        </w:r>
-        <w:r>
-          <w:rPr>
-            <w:rFonts w:asciiTheme="minorHAnsi" w:eastAsiaTheme="minorEastAsia" w:hAnsiTheme="minorHAnsi" w:cstheme="minorBidi"/>
-            <w:noProof/>
-            <w:sz w:val="22"/>
-            <w:szCs w:val="22"/>
-          </w:rPr>
-          <w:tab/>
-        </w:r>
-        <w:r>
-          <w:rPr>
-            <w:rStyle w:val="Hyperlink"/>
-            <w:noProof/>
-          </w:rPr>
-          <w:t>Desenvolvimento</w:t>
-        </w:r>
-        <w:r>
-          <w:rPr>
-            <w:noProof/>
-            <w:webHidden/>
-          </w:rPr>
-          <w:tab/>
-        </w:r>
-        <w:r>
-          <w:rPr>
-            <w:noProof/>
-            <w:webHidden/>
-          </w:rPr>
-          <w:fldChar w:fldCharType="begin"/>
-        </w:r>
-        <w:r>
-          <w:rPr>
-            <w:noProof/>
-            <w:webHidden/>
-          </w:rPr>
-          <w:instrText xml:space="preserve"> PAGEREF _Toc49841027 \h </w:instrText>
-        </w:r>
-        <w:r>
-          <w:rPr>
-            <w:noProof/>
-            <w:webHidden/>
-          </w:rPr>
-        </w:r>
-        <w:r>
-          <w:rPr>
-            <w:noProof/>
-            <w:webHidden/>
-          </w:rPr>
-          <w:fldChar w:fldCharType="separate"/>
-        </w:r>
-        <w:r>
-          <w:rPr>
-            <w:noProof/>
-            <w:webHidden/>
-          </w:rPr>
-          <w:t>3</w:t>
+          <w:t>4</w:t>
         </w:r>
         <w:r>
           <w:rPr>
@@ -885,13 +807,13 @@
           <w:szCs w:val="22"/>
         </w:rPr>
       </w:pPr>
-      <w:hyperlink w:anchor="_Toc49841028" w:history="1">
+      <w:hyperlink w:anchor="_Toc52574816" w:history="1">
         <w:r>
           <w:rPr>
             <w:rStyle w:val="Hyperlink"/>
             <w:noProof/>
           </w:rPr>
-          <w:t>2.1</w:t>
+          <w:t>1.4</w:t>
         </w:r>
         <w:r>
           <w:rPr>
@@ -907,7 +829,7 @@
             <w:rStyle w:val="Hyperlink"/>
             <w:noProof/>
           </w:rPr>
-          <w:t>Arquitetura</w:t>
+          <w:t>Tecnologias utilizadas</w:t>
         </w:r>
         <w:r>
           <w:rPr>
@@ -928,7 +850,7 @@
             <w:noProof/>
             <w:webHidden/>
           </w:rPr>
-          <w:instrText xml:space="preserve"> PAGEREF _Toc49841028 \h </w:instrText>
+          <w:instrText xml:space="preserve"> PAGEREF _Toc52574816 \h </w:instrText>
         </w:r>
         <w:r>
           <w:rPr>
@@ -948,7 +870,91 @@
             <w:noProof/>
             <w:webHidden/>
           </w:rPr>
-          <w:t>3</w:t>
+          <w:t>4</w:t>
+        </w:r>
+        <w:r>
+          <w:rPr>
+            <w:noProof/>
+            <w:webHidden/>
+          </w:rPr>
+          <w:fldChar w:fldCharType="end"/>
+        </w:r>
+      </w:hyperlink>
+    </w:p>
+    <w:p>
+      <w:pPr>
+        <w:pStyle w:val="Sumrio1"/>
+        <w:rPr>
+          <w:rFonts w:asciiTheme="minorHAnsi" w:eastAsiaTheme="minorEastAsia" w:hAnsiTheme="minorHAnsi" w:cstheme="minorBidi"/>
+          <w:noProof/>
+          <w:sz w:val="22"/>
+          <w:szCs w:val="22"/>
+        </w:rPr>
+      </w:pPr>
+      <w:hyperlink w:anchor="_Toc52574817" w:history="1">
+        <w:r>
+          <w:rPr>
+            <w:rStyle w:val="Hyperlink"/>
+            <w:noProof/>
+          </w:rPr>
+          <w:t>2</w:t>
+        </w:r>
+        <w:r>
+          <w:rPr>
+            <w:rFonts w:asciiTheme="minorHAnsi" w:eastAsiaTheme="minorEastAsia" w:hAnsiTheme="minorHAnsi" w:cstheme="minorBidi"/>
+            <w:noProof/>
+            <w:sz w:val="22"/>
+            <w:szCs w:val="22"/>
+          </w:rPr>
+          <w:tab/>
+        </w:r>
+        <w:r>
+          <w:rPr>
+            <w:rStyle w:val="Hyperlink"/>
+            <w:noProof/>
+          </w:rPr>
+          <w:t>Desenvolvimento</w:t>
+        </w:r>
+        <w:r>
+          <w:rPr>
+            <w:noProof/>
+            <w:webHidden/>
+          </w:rPr>
+          <w:tab/>
+        </w:r>
+        <w:r>
+          <w:rPr>
+            <w:noProof/>
+            <w:webHidden/>
+          </w:rPr>
+          <w:fldChar w:fldCharType="begin"/>
+        </w:r>
+        <w:r>
+          <w:rPr>
+            <w:noProof/>
+            <w:webHidden/>
+          </w:rPr>
+          <w:instrText xml:space="preserve"> PAGEREF _Toc52574817 \h </w:instrText>
+        </w:r>
+        <w:r>
+          <w:rPr>
+            <w:noProof/>
+            <w:webHidden/>
+          </w:rPr>
+        </w:r>
+        <w:r>
+          <w:rPr>
+            <w:noProof/>
+            <w:webHidden/>
+          </w:rPr>
+          <w:fldChar w:fldCharType="separate"/>
+        </w:r>
+        <w:r>
+          <w:rPr>
+            <w:noProof/>
+            <w:webHidden/>
+          </w:rPr>
+          <w:t>4</w:t>
         </w:r>
         <w:r>
           <w:rPr>
@@ -973,13 +979,13 @@
           <w:szCs w:val="22"/>
         </w:rPr>
       </w:pPr>
-      <w:hyperlink w:anchor="_Toc49841029" w:history="1">
+      <w:hyperlink w:anchor="_Toc52574818" w:history="1">
         <w:r>
           <w:rPr>
             <w:rStyle w:val="Hyperlink"/>
             <w:noProof/>
           </w:rPr>
-          <w:t>2.2</w:t>
+          <w:t>2.1</w:t>
         </w:r>
         <w:r>
           <w:rPr>
@@ -995,7 +1001,7 @@
             <w:rStyle w:val="Hyperlink"/>
             <w:noProof/>
           </w:rPr>
-          <w:t>Modelo de Dados</w:t>
+          <w:t>Arquitetura</w:t>
         </w:r>
         <w:r>
           <w:rPr>
@@ -1016,7 +1022,7 @@
             <w:noProof/>
             <w:webHidden/>
           </w:rPr>
-          <w:instrText xml:space="preserve"> PAGEREF _Toc49841029 \h </w:instrText>
+          <w:instrText xml:space="preserve"> PAGEREF _Toc52574818 \h </w:instrText>
         </w:r>
         <w:r>
           <w:rPr>
@@ -1036,7 +1042,7 @@
             <w:noProof/>
             <w:webHidden/>
           </w:rPr>
-          <w:t>4</w:t>
+          <w:t>5</w:t>
         </w:r>
         <w:r>
           <w:rPr>
@@ -1061,13 +1067,13 @@
           <w:szCs w:val="22"/>
         </w:rPr>
       </w:pPr>
-      <w:hyperlink w:anchor="_Toc49841030" w:history="1">
+      <w:hyperlink w:anchor="_Toc52574819" w:history="1">
         <w:r>
           <w:rPr>
             <w:rStyle w:val="Hyperlink"/>
             <w:noProof/>
           </w:rPr>
-          <w:t>2.3</w:t>
+          <w:t>2.2</w:t>
         </w:r>
         <w:r>
           <w:rPr>
@@ -1083,7 +1089,7 @@
             <w:rStyle w:val="Hyperlink"/>
             <w:noProof/>
           </w:rPr>
-          <w:t>Detalhes</w:t>
+          <w:t>Modelo de Dados</w:t>
         </w:r>
         <w:r>
           <w:rPr>
@@ -1104,7 +1110,7 @@
             <w:noProof/>
             <w:webHidden/>
           </w:rPr>
-          <w:instrText xml:space="preserve"> PAGEREF _Toc49841030 \h </w:instrText>
+          <w:instrText xml:space="preserve"> PAGEREF _Toc52574819 \h </w:instrText>
         </w:r>
         <w:r>
           <w:rPr>
@@ -1124,7 +1130,7 @@
             <w:noProof/>
             <w:webHidden/>
           </w:rPr>
-          <w:t>4</w:t>
+          <w:t>5</w:t>
         </w:r>
         <w:r>
           <w:rPr>
@@ -1137,7 +1143,11 @@
     </w:p>
     <w:p>
       <w:pPr>
-        <w:pStyle w:val="Sumrio1"/>
+        <w:pStyle w:val="Sumrio2"/>
+        <w:tabs>
+          <w:tab w:val="left" w:pos="960"/>
+          <w:tab w:val="right" w:pos="9062"/>
+        </w:tabs>
         <w:rPr>
           <w:rFonts w:asciiTheme="minorHAnsi" w:eastAsiaTheme="minorEastAsia" w:hAnsiTheme="minorHAnsi" w:cstheme="minorBidi"/>
           <w:noProof/>
@@ -1145,13 +1155,13 @@
           <w:szCs w:val="22"/>
         </w:rPr>
       </w:pPr>
-      <w:hyperlink w:anchor="_Toc49841031" w:history="1">
+      <w:hyperlink w:anchor="_Toc52574820" w:history="1">
         <w:r>
           <w:rPr>
             <w:rStyle w:val="Hyperlink"/>
             <w:noProof/>
           </w:rPr>
-          <w:t>3</w:t>
+          <w:t>2.3</w:t>
         </w:r>
         <w:r>
           <w:rPr>
@@ -1167,6 +1177,90 @@
             <w:rStyle w:val="Hyperlink"/>
             <w:noProof/>
           </w:rPr>
+          <w:t>Detalhes</w:t>
+        </w:r>
+        <w:r>
+          <w:rPr>
+            <w:noProof/>
+            <w:webHidden/>
+          </w:rPr>
+          <w:tab/>
+        </w:r>
+        <w:r>
+          <w:rPr>
+            <w:noProof/>
+            <w:webHidden/>
+          </w:rPr>
+          <w:fldChar w:fldCharType="begin"/>
+        </w:r>
+        <w:r>
+          <w:rPr>
+            <w:noProof/>
+            <w:webHidden/>
+          </w:rPr>
+          <w:instrText xml:space="preserve"> PAGEREF _Toc52574820 \h </w:instrText>
+        </w:r>
+        <w:r>
+          <w:rPr>
+            <w:noProof/>
+            <w:webHidden/>
+          </w:rPr>
+        </w:r>
+        <w:r>
+          <w:rPr>
+            <w:noProof/>
+            <w:webHidden/>
+          </w:rPr>
+          <w:fldChar w:fldCharType="separate"/>
+        </w:r>
+        <w:r>
+          <w:rPr>
+            <w:noProof/>
+            <w:webHidden/>
+          </w:rPr>
+          <w:t>6</w:t>
+        </w:r>
+        <w:r>
+          <w:rPr>
+            <w:noProof/>
+            <w:webHidden/>
+          </w:rPr>
+          <w:fldChar w:fldCharType="end"/>
+        </w:r>
+      </w:hyperlink>
+    </w:p>
+    <w:p>
+      <w:pPr>
+        <w:pStyle w:val="Sumrio1"/>
+        <w:rPr>
+          <w:rFonts w:asciiTheme="minorHAnsi" w:eastAsiaTheme="minorEastAsia" w:hAnsiTheme="minorHAnsi" w:cstheme="minorBidi"/>
+          <w:noProof/>
+          <w:sz w:val="22"/>
+          <w:szCs w:val="22"/>
+        </w:rPr>
+      </w:pPr>
+      <w:hyperlink w:anchor="_Toc52574821" w:history="1">
+        <w:r>
+          <w:rPr>
+            <w:rStyle w:val="Hyperlink"/>
+            <w:noProof/>
+          </w:rPr>
+          <w:t>3</w:t>
+        </w:r>
+        <w:r>
+          <w:rPr>
+            <w:rFonts w:asciiTheme="minorHAnsi" w:eastAsiaTheme="minorEastAsia" w:hAnsiTheme="minorHAnsi" w:cstheme="minorBidi"/>
+            <w:noProof/>
+            <w:sz w:val="22"/>
+            <w:szCs w:val="22"/>
+          </w:rPr>
+          <w:tab/>
+        </w:r>
+        <w:r>
+          <w:rPr>
+            <w:rStyle w:val="Hyperlink"/>
+            <w:noProof/>
+          </w:rPr>
           <w:t>Resultados e Discussão</w:t>
         </w:r>
         <w:r>
@@ -1188,7 +1282,7 @@
             <w:noProof/>
             <w:webHidden/>
           </w:rPr>
-          <w:instrText xml:space="preserve"> PAGEREF _Toc49841031 \h </w:instrText>
+          <w:instrText xml:space="preserve"> PAGEREF _Toc52574821 \h </w:instrText>
         </w:r>
         <w:r>
           <w:rPr>
@@ -1208,7 +1302,7 @@
             <w:noProof/>
             <w:webHidden/>
           </w:rPr>
-          <w:t>4</w:t>
+          <w:t>6</w:t>
         </w:r>
         <w:r>
           <w:rPr>
@@ -1263,7 +1357,7 @@
       <w:pPr>
         <w:pStyle w:val="Ttulo1"/>
       </w:pPr>
-      <w:bookmarkStart w:id="3" w:name="_Toc49841023"/>
+      <w:bookmarkStart w:id="3" w:name="_Toc52574812"/>
       <w:r>
         <w:lastRenderedPageBreak/>
         <w:t>Introdução</w:t>
@@ -1271,7 +1365,6 @@
       <w:bookmarkEnd w:id="3"/>
     </w:p>
     <w:p>
-      <w:bookmarkStart w:id="4" w:name="_Toc49841024"/>
       <w:r>
         <w:t xml:space="preserve">Este capítulo apresenta o problema a ser resolvido e o objetivo deste trabalho. </w:t>
       </w:r>
@@ -1280,41 +1373,318 @@
       <w:pPr>
         <w:pStyle w:val="Ttulo2"/>
       </w:pPr>
+      <w:bookmarkStart w:id="4" w:name="_Toc52574813"/>
       <w:r>
         <w:t>Definição do problema</w:t>
       </w:r>
       <w:bookmarkEnd w:id="4"/>
     </w:p>
     <w:p>
-      <w:bookmarkStart w:id="5" w:name="_Toc49841025"/>
-      <w:r>
-        <w:t xml:space="preserve">Os sistemas </w:t>
-      </w:r>
-      <w:r>
-        <w:t>web são soluções que podem ser desenvolvidas para torna</w:t>
+      <w:r>
+        <w:t>Sistemas</w:t>
+      </w:r>
+      <w:r>
+        <w:t xml:space="preserve"> </w:t>
+      </w:r>
+      <w:r>
+        <w:t>web são soluções</w:t>
+      </w:r>
+      <w:r>
+        <w:t xml:space="preserve"> computacionais,</w:t>
+      </w:r>
+      <w:r>
+        <w:t xml:space="preserve"> </w:t>
+      </w:r>
+      <w:r>
+        <w:rPr>
+          <w:highlight w:val="yellow"/>
+        </w:rPr>
+        <w:t xml:space="preserve">acessíveis facilmente a partir de </w:t>
+      </w:r>
+      <w:r>
+        <w:rPr>
+          <w:highlight w:val="yellow"/>
+        </w:rPr>
+        <w:t xml:space="preserve">navegadores instalados em </w:t>
+      </w:r>
+      <w:r>
+        <w:rPr>
+          <w:highlight w:val="yellow"/>
+        </w:rPr>
+        <w:t xml:space="preserve">dispositivos tais como notebooks, tablets e </w:t>
+      </w:r>
+      <w:proofErr w:type="spellStart"/>
+      <w:r>
+        <w:rPr>
+          <w:highlight w:val="yellow"/>
+        </w:rPr>
+        <w:t>smart</w:t>
+      </w:r>
+      <w:proofErr w:type="spellEnd"/>
+      <w:r>
+        <w:rPr>
+          <w:highlight w:val="yellow"/>
+        </w:rPr>
+        <w:t xml:space="preserve"> </w:t>
+      </w:r>
+      <w:proofErr w:type="spellStart"/>
+      <w:r>
+        <w:rPr>
+          <w:highlight w:val="yellow"/>
+        </w:rPr>
+        <w:t>phones</w:t>
+      </w:r>
+      <w:proofErr w:type="spellEnd"/>
+      <w:r>
+        <w:rPr>
+          <w:highlight w:val="yellow"/>
+        </w:rPr>
+        <w:t>,</w:t>
+      </w:r>
+      <w:r>
+        <w:t xml:space="preserve"> que </w:t>
+      </w:r>
+      <w:r>
+        <w:rPr>
+          <w:highlight w:val="yellow"/>
+        </w:rPr>
+        <w:t xml:space="preserve">são </w:t>
+      </w:r>
+      <w:r>
+        <w:t>desenvolvidas para torna</w:t>
       </w:r>
       <w:r>
         <w:t>r</w:t>
       </w:r>
       <w:r>
-        <w:t xml:space="preserve"> processos manuais mais simples, rápidos e eficazes. Os sistemas também podem ser elaborados como forma de integrar a comunicação e permitir que determinados públicos tenham acessos as informações</w:t>
-      </w:r>
-      <w:r>
-        <w:t>, sendo eles personalizados de acordo com a necessidade do cliente</w:t>
+        <w:t xml:space="preserve"> processos manuais mais simples, rápidos e eficazes. </w:t>
+      </w:r>
+      <w:r>
+        <w:rPr>
+          <w:highlight w:val="yellow"/>
+        </w:rPr>
+        <w:t>Esses</w:t>
+      </w:r>
+      <w:r>
+        <w:t xml:space="preserve"> </w:t>
+      </w:r>
+      <w:r>
+        <w:t xml:space="preserve">sistemas também podem ser elaborados como forma de integrar a comunicação e permitir que determinados públicos tenham acesso </w:t>
+      </w:r>
+      <w:r>
+        <w:rPr>
+          <w:highlight w:val="yellow"/>
+        </w:rPr>
+        <w:t>à</w:t>
+      </w:r>
+      <w:r>
+        <w:rPr>
+          <w:highlight w:val="yellow"/>
+        </w:rPr>
+        <w:t>s</w:t>
+      </w:r>
+      <w:r>
+        <w:t xml:space="preserve"> informações</w:t>
       </w:r>
       <w:r>
         <w:t xml:space="preserve">. </w:t>
       </w:r>
-    </w:p>
-    <w:p>
-      <w:r>
-        <w:t xml:space="preserve">A automação dos testes trará a redução de custos, a chance de testes mais precisos, o ganho na qualidade gerando um maior retorno em relação aos investimentos realizados e com isso um melhor resultado para o cliente, deixando-os mais satisfeitos e seguros com o desenvolvimento do software desejado. </w:t>
+      <w:r>
+        <w:rPr>
+          <w:highlight w:val="yellow"/>
+        </w:rPr>
+        <w:t>Sistemas web são também personalizáveis</w:t>
+      </w:r>
+      <w:r>
+        <w:t xml:space="preserve"> de acordo com a</w:t>
+      </w:r>
+      <w:r>
+        <w:t>s</w:t>
+      </w:r>
+      <w:r>
+        <w:t xml:space="preserve"> necessidade</w:t>
+      </w:r>
+      <w:r>
+        <w:t>s e preferências</w:t>
+      </w:r>
+      <w:r>
+        <w:t xml:space="preserve"> do </w:t>
+      </w:r>
+      <w:r>
+        <w:t>usuário final</w:t>
+      </w:r>
+      <w:r>
+        <w:t xml:space="preserve">. </w:t>
+      </w:r>
+    </w:p>
+    <w:p>
+      <w:r>
+        <w:rPr>
+          <w:highlight w:val="yellow"/>
+        </w:rPr>
+        <w:t>Dada tamanha abrangência e importância de tais sistema</w:t>
+      </w:r>
+      <w:r>
+        <w:rPr>
+          <w:highlight w:val="yellow"/>
+        </w:rPr>
+        <w:t>s</w:t>
+      </w:r>
+      <w:r>
+        <w:rPr>
+          <w:highlight w:val="yellow"/>
+        </w:rPr>
+        <w:t xml:space="preserve">, a demanda pela qualidade, e consequente necessidade de verificação </w:t>
+      </w:r>
+      <w:r>
+        <w:rPr>
+          <w:highlight w:val="yellow"/>
+        </w:rPr>
+        <w:t>deles</w:t>
+      </w:r>
+      <w:r>
+        <w:rPr>
+          <w:highlight w:val="yellow"/>
+        </w:rPr>
+        <w:t xml:space="preserve">, é inquestionável. Portanto, </w:t>
+      </w:r>
+      <w:r>
+        <w:rPr>
+          <w:highlight w:val="yellow"/>
+        </w:rPr>
+        <w:t>o desenvolvimento de soluções cujo intuito é testar e garantir a qualidade de tais sistemas é oportuno e altamente relevante. Apesar disso, testar sistemas web não é tarefa fácil e requer, frequentemente, a automação de tarefas que são executadas ora por usuários humanos (</w:t>
+      </w:r>
+      <w:proofErr w:type="spellStart"/>
+      <w:r>
+        <w:rPr>
+          <w:highlight w:val="yellow"/>
+        </w:rPr>
+        <w:t>e.g</w:t>
+      </w:r>
+      <w:proofErr w:type="spellEnd"/>
+      <w:r>
+        <w:rPr>
+          <w:highlight w:val="yellow"/>
+        </w:rPr>
+        <w:t>: interação com formulários e navegação entre páginas)</w:t>
+      </w:r>
+      <w:r>
+        <w:rPr>
+          <w:highlight w:val="yellow"/>
+        </w:rPr>
+        <w:t xml:space="preserve"> e</w:t>
+      </w:r>
+      <w:r>
+        <w:rPr>
+          <w:highlight w:val="yellow"/>
+        </w:rPr>
+        <w:t xml:space="preserve"> ora por outros sistemas computacionais (e.g.: testes de APIs de serviços web).</w:t>
+      </w:r>
+    </w:p>
+    <w:p>
+      <w:pPr>
+        <w:rPr>
+          <w:highlight w:val="yellow"/>
+        </w:rPr>
+      </w:pPr>
+      <w:r>
+        <w:rPr>
+          <w:highlight w:val="yellow"/>
+        </w:rPr>
+        <w:t xml:space="preserve">Considerando o que foi dito até o momento, pode-se concluir que o desenvolvimento de sistemas para testes, e consequente garantia da qualidade dos </w:t>
+      </w:r>
+      <w:r>
+        <w:rPr>
+          <w:highlight w:val="yellow"/>
+        </w:rPr>
+        <w:t>sistemas web testados</w:t>
+      </w:r>
+      <w:r>
+        <w:rPr>
+          <w:highlight w:val="yellow"/>
+        </w:rPr>
+        <w:t>, é um problema de extrema importância e não tão fácil de ser endereçado. Apesar disso, tais sistemas de teste acarretarão, sem dúvidas, melhoria d</w:t>
+      </w:r>
+      <w:r>
+        <w:rPr>
+          <w:highlight w:val="yellow"/>
+        </w:rPr>
+        <w:t xml:space="preserve">a </w:t>
+      </w:r>
+      <w:r>
+        <w:rPr>
+          <w:highlight w:val="yellow"/>
+        </w:rPr>
+        <w:t>qualidade com consequente redução de custos com o sistema (a médio e longo prazo) a</w:t>
+      </w:r>
+      <w:r>
+        <w:rPr>
+          <w:highlight w:val="yellow"/>
+        </w:rPr>
+        <w:t xml:space="preserve">lém de aumentar a satisfação geral do usuário final. </w:t>
+      </w:r>
+    </w:p>
+    <w:p>
+      <w:r>
+        <w:rPr>
+          <w:highlight w:val="yellow"/>
+        </w:rPr>
+        <w:t>Esse trabalho aborda o problema de gerenciamento e execução de casos de teste a partir de um sistema web que evita que casos de teste sejam especificados</w:t>
+      </w:r>
+      <w:r>
+        <w:rPr>
+          <w:highlight w:val="yellow"/>
+        </w:rPr>
+        <w:t xml:space="preserve"> e executados</w:t>
+      </w:r>
+      <w:r>
+        <w:rPr>
+          <w:highlight w:val="yellow"/>
+        </w:rPr>
+        <w:t xml:space="preserve"> a partir de </w:t>
+      </w:r>
+      <w:r>
+        <w:rPr>
+          <w:highlight w:val="yellow"/>
+        </w:rPr>
+        <w:t>interação direta com</w:t>
+      </w:r>
+      <w:r>
+        <w:rPr>
+          <w:highlight w:val="yellow"/>
+        </w:rPr>
+        <w:t xml:space="preserve"> código-fonte de teste. Dessa maneira, casos de teste podem ser facilmente gerenciados e reutilizados</w:t>
+      </w:r>
+      <w:r>
+        <w:rPr>
+          <w:highlight w:val="yellow"/>
+        </w:rPr>
+        <w:t>,</w:t>
+      </w:r>
+      <w:r>
+        <w:rPr>
+          <w:highlight w:val="yellow"/>
+        </w:rPr>
+        <w:t xml:space="preserve"> </w:t>
+      </w:r>
+      <w:r>
+        <w:rPr>
+          <w:highlight w:val="yellow"/>
+        </w:rPr>
+        <w:t>em sistemas web similares</w:t>
+      </w:r>
+      <w:r>
+        <w:rPr>
+          <w:highlight w:val="yellow"/>
+        </w:rPr>
+        <w:t>, sem interação com código para teste.</w:t>
       </w:r>
     </w:p>
     <w:p>
       <w:pPr>
         <w:pStyle w:val="Ttulo2"/>
       </w:pPr>
+      <w:bookmarkStart w:id="5" w:name="_Toc52574814"/>
       <w:r>
         <w:t>Objetivo</w:t>
       </w:r>
@@ -1322,12 +1692,63 @@
     </w:p>
     <w:p>
       <w:r>
-        <w:t xml:space="preserve">O objetivo deste projeto é utilizar uma interface web em conjunto com ferramentas tais como o selenium webdriver para automatizar diversas categorias de teste. </w:t>
-      </w:r>
-    </w:p>
-    <w:p>
-      <w:r>
-        <w:t>Alguns dos testes a serem automatizados são:</w:t>
+        <w:t xml:space="preserve">O objetivo deste projeto </w:t>
+      </w:r>
+      <w:r>
+        <w:t xml:space="preserve">é desenvolver um sistema web que interaja com um conjunto de ferramentas de teste, tais como o </w:t>
+      </w:r>
+      <w:proofErr w:type="spellStart"/>
+      <w:r>
+        <w:t>Selenium</w:t>
+      </w:r>
+      <w:proofErr w:type="spellEnd"/>
+      <w:r>
+        <w:t xml:space="preserve"> Web Driver e o </w:t>
+      </w:r>
+      <w:proofErr w:type="spellStart"/>
+      <w:r>
+        <w:t>JUnit</w:t>
+      </w:r>
+      <w:proofErr w:type="spellEnd"/>
+      <w:r>
+        <w:t xml:space="preserve"> 5, de modo a automatizar a execução de testes em sistemas web, sejam esses sistemas compostos por APIs ou interfaces com o usuário tais como páginas contendo formulários. </w:t>
+      </w:r>
+    </w:p>
+    <w:p>
+      <w:r>
+        <w:rPr>
+          <w:highlight w:val="yellow"/>
+        </w:rPr>
+        <w:lastRenderedPageBreak/>
+        <w:t>Além disso, o sistema a ser desenvolvido deverá ser capaz de gerenciar os casos de teste de modo  a permitir sua reutilização em sistemas similares.</w:t>
+      </w:r>
+    </w:p>
+    <w:p>
+      <w:r>
+        <w:t xml:space="preserve"> </w:t>
+      </w:r>
+    </w:p>
+    <w:p>
+      <w:pPr>
+        <w:pStyle w:val="Ttulo2"/>
+      </w:pPr>
+      <w:bookmarkStart w:id="6" w:name="_Toc52574815"/>
+      <w:r>
+        <w:t>Escopo</w:t>
+      </w:r>
+      <w:bookmarkEnd w:id="6"/>
+    </w:p>
+    <w:p>
+      <w:pPr>
+        <w:rPr>
+          <w:highlight w:val="yellow"/>
+        </w:rPr>
+      </w:pPr>
+      <w:r>
+        <w:rPr>
+          <w:highlight w:val="yellow"/>
+        </w:rPr>
+        <w:t>As características do sistema a ser desenvolvido incluem:</w:t>
       </w:r>
     </w:p>
     <w:p>
@@ -1335,12 +1756,17 @@
         <w:pStyle w:val="PargrafodaLista"/>
         <w:numPr>
           <w:ilvl w:val="0"/>
-          <w:numId w:val="15"/>
+          <w:numId w:val="17"/>
         </w:numPr>
-        <w:ind w:left="993" w:hanging="284"/>
-      </w:pPr>
-      <w:r>
-        <w:t>Teste de navegabilidade;</w:t>
+        <w:rPr>
+          <w:highlight w:val="yellow"/>
+        </w:rPr>
+      </w:pPr>
+      <w:r>
+        <w:rPr>
+          <w:highlight w:val="yellow"/>
+        </w:rPr>
+        <w:t>Gerenciamento dos casos de teste (CRUD);</w:t>
       </w:r>
     </w:p>
     <w:p>
@@ -1348,12 +1774,17 @@
         <w:pStyle w:val="PargrafodaLista"/>
         <w:numPr>
           <w:ilvl w:val="0"/>
-          <w:numId w:val="15"/>
+          <w:numId w:val="17"/>
         </w:numPr>
-        <w:ind w:left="993" w:hanging="284"/>
-      </w:pPr>
-      <w:r>
-        <w:t>Teste de segurança;</w:t>
+        <w:rPr>
+          <w:highlight w:val="yellow"/>
+        </w:rPr>
+      </w:pPr>
+      <w:r>
+        <w:rPr>
+          <w:highlight w:val="yellow"/>
+        </w:rPr>
+        <w:t>Execução de testes a partir de interação somente com uma interface web (via navegador);</w:t>
       </w:r>
     </w:p>
     <w:p>
@@ -1361,12 +1792,17 @@
         <w:pStyle w:val="PargrafodaLista"/>
         <w:numPr>
           <w:ilvl w:val="0"/>
-          <w:numId w:val="15"/>
+          <w:numId w:val="17"/>
         </w:numPr>
-        <w:ind w:left="993" w:hanging="284"/>
-      </w:pPr>
-      <w:r>
-        <w:t>Teste de funcionalidade (serviço);</w:t>
+        <w:rPr>
+          <w:highlight w:val="yellow"/>
+        </w:rPr>
+      </w:pPr>
+      <w:r>
+        <w:rPr>
+          <w:highlight w:val="yellow"/>
+        </w:rPr>
+        <w:t>Execução de testes funcionais;</w:t>
       </w:r>
     </w:p>
     <w:p>
@@ -1374,27 +1810,106 @@
         <w:pStyle w:val="PargrafodaLista"/>
         <w:numPr>
           <w:ilvl w:val="0"/>
-          <w:numId w:val="15"/>
+          <w:numId w:val="17"/>
         </w:numPr>
-        <w:ind w:left="993" w:hanging="284"/>
-      </w:pPr>
-      <w:r>
-        <w:t>Teste de confiabilidade;</w:t>
-      </w:r>
+        <w:rPr>
+          <w:highlight w:val="yellow"/>
+        </w:rPr>
+      </w:pPr>
+      <w:r>
+        <w:rPr>
+          <w:highlight w:val="yellow"/>
+        </w:rPr>
+        <w:t>Execução de testes de confiabilidade;</w:t>
+      </w:r>
+    </w:p>
+    <w:p>
+      <w:pPr>
+        <w:pStyle w:val="PargrafodaLista"/>
+        <w:numPr>
+          <w:ilvl w:val="0"/>
+          <w:numId w:val="17"/>
+        </w:numPr>
+        <w:rPr>
+          <w:highlight w:val="yellow"/>
+        </w:rPr>
+      </w:pPr>
+      <w:r>
+        <w:rPr>
+          <w:highlight w:val="yellow"/>
+        </w:rPr>
+        <w:t>Execução de testes de navegabilidade;</w:t>
+      </w:r>
+    </w:p>
+    <w:p>
+      <w:pPr>
+        <w:pStyle w:val="PargrafodaLista"/>
+        <w:numPr>
+          <w:ilvl w:val="0"/>
+          <w:numId w:val="17"/>
+        </w:numPr>
+        <w:rPr>
+          <w:highlight w:val="yellow"/>
+        </w:rPr>
+      </w:pPr>
+      <w:r>
+        <w:rPr>
+          <w:highlight w:val="yellow"/>
+        </w:rPr>
+        <w:t>Execução de testes de segurança.</w:t>
+      </w:r>
+    </w:p>
+    <w:p>
+      <w:pPr>
+        <w:ind w:firstLine="0"/>
+      </w:pPr>
     </w:p>
     <w:p>
       <w:pPr>
         <w:pStyle w:val="Ttulo2"/>
       </w:pPr>
-      <w:bookmarkStart w:id="6" w:name="_Toc49841026"/>
-      <w:r>
-        <w:t>Escopo</w:t>
-      </w:r>
-      <w:bookmarkEnd w:id="6"/>
-    </w:p>
-    <w:p>
-      <w:r>
-        <w:t>Para o desenvolvimento do projeto serão utilizadas as seguintes tecnologias:</w:t>
+      <w:bookmarkStart w:id="7" w:name="_Toc52574816"/>
+      <w:r>
+        <w:t>Tecnologias utilizadas</w:t>
+      </w:r>
+      <w:bookmarkEnd w:id="7"/>
+    </w:p>
+    <w:p>
+      <w:pPr>
+        <w:rPr>
+          <w:highlight w:val="yellow"/>
+        </w:rPr>
+      </w:pPr>
+      <w:r>
+        <w:rPr>
+          <w:highlight w:val="yellow"/>
+        </w:rPr>
+        <w:t>Para o desenvolvimento d</w:t>
+      </w:r>
+      <w:r>
+        <w:rPr>
+          <w:highlight w:val="yellow"/>
+        </w:rPr>
+        <w:t>esse projeto, as seguintes tecnologias serão utilizadas:</w:t>
+      </w:r>
+    </w:p>
+    <w:p>
+      <w:pPr>
+        <w:pStyle w:val="PargrafodaLista"/>
+        <w:numPr>
+          <w:ilvl w:val="0"/>
+          <w:numId w:val="18"/>
+        </w:numPr>
+        <w:ind w:left="1134" w:hanging="283"/>
+        <w:rPr>
+          <w:highlight w:val="yellow"/>
+        </w:rPr>
+      </w:pPr>
+      <w:r>
+        <w:rPr>
+          <w:highlight w:val="yellow"/>
+        </w:rPr>
+        <w:t>Java EE 8;</w:t>
       </w:r>
     </w:p>
     <w:p>
@@ -1405,15 +1920,43 @@
           <w:numId w:val="16"/>
         </w:numPr>
         <w:ind w:left="1134" w:hanging="283"/>
-      </w:pPr>
-      <w:r>
-        <w:t xml:space="preserve">Java </w:t>
-      </w:r>
-      <w:r>
-        <w:t>E</w:t>
-      </w:r>
-      <w:r>
-        <w:t>E 8</w:t>
+        <w:rPr>
+          <w:highlight w:val="yellow"/>
+        </w:rPr>
+      </w:pPr>
+      <w:proofErr w:type="spellStart"/>
+      <w:r>
+        <w:rPr>
+          <w:highlight w:val="yellow"/>
+        </w:rPr>
+        <w:t>Gradle</w:t>
+      </w:r>
+      <w:proofErr w:type="spellEnd"/>
+      <w:r>
+        <w:rPr>
+          <w:highlight w:val="yellow"/>
+        </w:rPr>
+        <w:t xml:space="preserve"> </w:t>
+      </w:r>
+      <w:proofErr w:type="spellStart"/>
+      <w:r>
+        <w:rPr>
+          <w:highlight w:val="yellow"/>
+        </w:rPr>
+        <w:t>Version</w:t>
+      </w:r>
+      <w:proofErr w:type="spellEnd"/>
+      <w:r>
+        <w:rPr>
+          <w:highlight w:val="yellow"/>
+        </w:rPr>
+        <w:t xml:space="preserve"> 6.6.1</w:t>
+      </w:r>
+      <w:r>
+        <w:rPr>
+          <w:highlight w:val="yellow"/>
+        </w:rPr>
+        <w:t>;</w:t>
       </w:r>
     </w:p>
     <w:p>
@@ -1424,9 +1967,37 @@
           <w:numId w:val="16"/>
         </w:numPr>
         <w:ind w:left="1134" w:hanging="283"/>
-      </w:pPr>
-      <w:r>
-        <w:t>Gradle Version 6.6.1</w:t>
+        <w:rPr>
+          <w:highlight w:val="yellow"/>
+        </w:rPr>
+      </w:pPr>
+      <w:proofErr w:type="spellStart"/>
+      <w:r>
+        <w:rPr>
+          <w:highlight w:val="yellow"/>
+        </w:rPr>
+        <w:t>Selenium</w:t>
+      </w:r>
+      <w:proofErr w:type="spellEnd"/>
+      <w:r>
+        <w:rPr>
+          <w:highlight w:val="yellow"/>
+        </w:rPr>
+        <w:t xml:space="preserve"> </w:t>
+      </w:r>
+      <w:proofErr w:type="spellStart"/>
+      <w:r>
+        <w:rPr>
+          <w:highlight w:val="yellow"/>
+        </w:rPr>
+        <w:t>Webdriver</w:t>
+      </w:r>
+      <w:proofErr w:type="spellEnd"/>
+      <w:r>
+        <w:rPr>
+          <w:highlight w:val="yellow"/>
+        </w:rPr>
+        <w:t>;</w:t>
       </w:r>
     </w:p>
     <w:p>
@@ -1437,20 +2008,113 @@
           <w:numId w:val="16"/>
         </w:numPr>
         <w:ind w:left="1134" w:hanging="283"/>
-      </w:pPr>
-      <w:r>
-        <w:t>Selenium Webdriver</w:t>
+        <w:rPr>
+          <w:highlight w:val="yellow"/>
+        </w:rPr>
+      </w:pPr>
+      <w:proofErr w:type="spellStart"/>
+      <w:r>
+        <w:rPr>
+          <w:highlight w:val="yellow"/>
+        </w:rPr>
+        <w:t>JUnit</w:t>
+      </w:r>
+      <w:proofErr w:type="spellEnd"/>
+      <w:r>
+        <w:rPr>
+          <w:highlight w:val="yellow"/>
+        </w:rPr>
+        <w:t xml:space="preserve"> 5;</w:t>
+      </w:r>
+    </w:p>
+    <w:p>
+      <w:pPr>
+        <w:pStyle w:val="PargrafodaLista"/>
+        <w:numPr>
+          <w:ilvl w:val="0"/>
+          <w:numId w:val="16"/>
+        </w:numPr>
+        <w:ind w:left="1134" w:hanging="283"/>
+        <w:rPr>
+          <w:highlight w:val="yellow"/>
+        </w:rPr>
+      </w:pPr>
+      <w:r>
+        <w:rPr>
+          <w:highlight w:val="yellow"/>
+        </w:rPr>
+        <w:t>HTML 5</w:t>
+      </w:r>
+    </w:p>
+    <w:p>
+      <w:pPr>
+        <w:pStyle w:val="PargrafodaLista"/>
+        <w:numPr>
+          <w:ilvl w:val="0"/>
+          <w:numId w:val="16"/>
+        </w:numPr>
+        <w:ind w:left="1134" w:hanging="283"/>
+        <w:rPr>
+          <w:highlight w:val="yellow"/>
+        </w:rPr>
+      </w:pPr>
+      <w:r>
+        <w:rPr>
+          <w:highlight w:val="yellow"/>
+        </w:rPr>
+        <w:t>CSS 3</w:t>
+      </w:r>
+    </w:p>
+    <w:p>
+      <w:pPr>
+        <w:pStyle w:val="PargrafodaLista"/>
+        <w:numPr>
+          <w:ilvl w:val="0"/>
+          <w:numId w:val="16"/>
+        </w:numPr>
+        <w:ind w:left="1134" w:hanging="283"/>
+        <w:rPr>
+          <w:highlight w:val="yellow"/>
+        </w:rPr>
+      </w:pPr>
+      <w:proofErr w:type="spellStart"/>
+      <w:r>
+        <w:rPr>
+          <w:highlight w:val="yellow"/>
+        </w:rPr>
+        <w:t>JavaScript</w:t>
+      </w:r>
+      <w:proofErr w:type="spellEnd"/>
+      <w:r>
+        <w:rPr>
+          <w:highlight w:val="yellow"/>
+        </w:rPr>
+        <w:t xml:space="preserve"> (</w:t>
+      </w:r>
+      <w:proofErr w:type="spellStart"/>
+      <w:r>
+        <w:rPr>
+          <w:highlight w:val="yellow"/>
+        </w:rPr>
+        <w:t>ECMAScript</w:t>
+      </w:r>
+      <w:proofErr w:type="spellEnd"/>
+      <w:r>
+        <w:rPr>
+          <w:highlight w:val="yellow"/>
+        </w:rPr>
+        <w:t xml:space="preserve"> 6)</w:t>
       </w:r>
     </w:p>
     <w:p>
       <w:pPr>
         <w:pStyle w:val="Ttulo1"/>
       </w:pPr>
-      <w:bookmarkStart w:id="7" w:name="_Toc49841027"/>
+      <w:bookmarkStart w:id="8" w:name="_Toc52574817"/>
       <w:r>
         <w:t>Desenvolvimento</w:t>
       </w:r>
-      <w:bookmarkEnd w:id="7"/>
+      <w:bookmarkEnd w:id="8"/>
     </w:p>
     <w:p>
       <w:pPr>
@@ -1481,14 +2145,14 @@
       <w:pPr>
         <w:pStyle w:val="Ttulo2"/>
       </w:pPr>
-      <w:bookmarkStart w:id="8" w:name="_Toc438245121"/>
-      <w:bookmarkStart w:id="9" w:name="_Toc49841028"/>
+      <w:bookmarkStart w:id="9" w:name="_Toc438245121"/>
+      <w:bookmarkStart w:id="10" w:name="_Toc52574818"/>
       <w:r>
         <w:lastRenderedPageBreak/>
         <w:t>Arquitetura</w:t>
       </w:r>
-      <w:bookmarkEnd w:id="8"/>
       <w:bookmarkEnd w:id="9"/>
+      <w:bookmarkEnd w:id="10"/>
     </w:p>
     <w:p>
       <w:pPr>
@@ -1550,11 +2214,11 @@
       <w:pPr>
         <w:pStyle w:val="Ttulo2"/>
       </w:pPr>
-      <w:bookmarkStart w:id="10" w:name="_Toc49841029"/>
+      <w:bookmarkStart w:id="11" w:name="_Toc52574819"/>
       <w:r>
         <w:t>Modelo de Dados</w:t>
       </w:r>
-      <w:bookmarkEnd w:id="10"/>
+      <w:bookmarkEnd w:id="11"/>
     </w:p>
     <w:p>
       <w:r>
@@ -1583,14 +2247,27 @@
       <w:r>
         <w:t xml:space="preserve">Figura </w:t>
       </w:r>
-      <w:fldSimple w:instr=" SEQ Figura \* ARABIC ">
-        <w:r>
-          <w:rPr>
-            <w:noProof/>
-          </w:rPr>
-          <w:t>1</w:t>
-        </w:r>
-      </w:fldSimple>
+      <w:r>
+        <w:fldChar w:fldCharType="begin"/>
+      </w:r>
+      <w:r>
+        <w:instrText xml:space="preserve"> SEQ Figura \* ARABIC </w:instrText>
+      </w:r>
+      <w:r>
+        <w:fldChar w:fldCharType="separate"/>
+      </w:r>
+      <w:r>
+        <w:rPr>
+          <w:noProof/>
+        </w:rPr>
+        <w:t>1</w:t>
+      </w:r>
+      <w:r>
+        <w:rPr>
+          <w:noProof/>
+        </w:rPr>
+        <w:fldChar w:fldCharType="end"/>
+      </w:r>
       <w:r>
         <w:t xml:space="preserve"> –</w:t>
       </w:r>
@@ -1651,12 +2328,12 @@
       <w:pPr>
         <w:pStyle w:val="Ttulo2"/>
       </w:pPr>
-      <w:bookmarkStart w:id="11" w:name="_Toc49841030"/>
+      <w:bookmarkStart w:id="12" w:name="_Toc52574820"/>
       <w:r>
         <w:lastRenderedPageBreak/>
         <w:t>Detalhes</w:t>
       </w:r>
-      <w:bookmarkEnd w:id="11"/>
+      <w:bookmarkEnd w:id="12"/>
     </w:p>
     <w:p>
       <w:pPr>
@@ -1689,11 +2366,11 @@
       <w:pPr>
         <w:pStyle w:val="Ttulo1"/>
       </w:pPr>
-      <w:bookmarkStart w:id="12" w:name="_Toc49841031"/>
+      <w:bookmarkStart w:id="13" w:name="_Toc52574821"/>
       <w:r>
         <w:t>Resultados e Discussão</w:t>
       </w:r>
-      <w:bookmarkEnd w:id="12"/>
+      <w:bookmarkEnd w:id="13"/>
     </w:p>
     <w:p>
       <w:pPr>
@@ -1868,17 +2545,17 @@
         <v:path o:extrusionok="f" gradientshapeok="t" o:connecttype="rect"/>
         <o:lock v:ext="edit" aspectratio="t"/>
       </v:shapetype>
-      <v:shape id="_x0000_i1062" type="#_x0000_t75" style="width:3in;height:3in" o:bullet="t"/>
+      <v:shape id="_x0000_i1479" type="#_x0000_t75" style="width:3in;height:3in" o:bullet="t"/>
     </w:pict>
   </w:numPicBullet>
   <w:numPicBullet w:numPicBulletId="1">
     <w:pict>
-      <v:shape id="_x0000_i1063" type="#_x0000_t75" style="width:3in;height:3in" o:bullet="t"/>
+      <v:shape id="_x0000_i1480" type="#_x0000_t75" style="width:3in;height:3in" o:bullet="t"/>
     </w:pict>
   </w:numPicBullet>
   <w:numPicBullet w:numPicBulletId="2">
     <w:pict>
-      <v:shape id="_x0000_i1064" type="#_x0000_t75" style="width:3in;height:3in" o:bullet="t"/>
+      <v:shape id="_x0000_i1481" type="#_x0000_t75" style="width:3in;height:3in" o:bullet="t"/>
     </w:pict>
   </w:numPicBullet>
   <w:abstractNum w:abstractNumId="0" w15:restartNumberingAfterBreak="0">
@@ -3545,9 +4222,235 @@
     </w:lvl>
   </w:abstractNum>
   <w:abstractNum w:abstractNumId="15" w15:restartNumberingAfterBreak="0">
+    <w:nsid w:val="5FA87471"/>
+    <w:multiLevelType w:val="hybridMultilevel"/>
+    <w:tmpl w:val="AB402598"/>
+    <w:lvl w:ilvl="0" w:tplc="04160001">
+      <w:start w:val="1"/>
+      <w:numFmt w:val="bullet"/>
+      <w:lvlText w:val=""/>
+      <w:lvlJc w:val="left"/>
+      <w:pPr>
+        <w:ind w:left="720" w:hanging="360"/>
+      </w:pPr>
+      <w:rPr>
+        <w:rFonts w:ascii="Symbol" w:hAnsi="Symbol" w:hint="default"/>
+      </w:rPr>
+    </w:lvl>
+    <w:lvl w:ilvl="1" w:tplc="04160003" w:tentative="1">
+      <w:start w:val="1"/>
+      <w:numFmt w:val="bullet"/>
+      <w:lvlText w:val="o"/>
+      <w:lvlJc w:val="left"/>
+      <w:pPr>
+        <w:ind w:left="1440" w:hanging="360"/>
+      </w:pPr>
+      <w:rPr>
+        <w:rFonts w:ascii="Courier New" w:hAnsi="Courier New" w:cs="Courier New" w:hint="default"/>
+      </w:rPr>
+    </w:lvl>
+    <w:lvl w:ilvl="2" w:tplc="04160005" w:tentative="1">
+      <w:start w:val="1"/>
+      <w:numFmt w:val="bullet"/>
+      <w:lvlText w:val=""/>
+      <w:lvlJc w:val="left"/>
+      <w:pPr>
+        <w:ind w:left="2160" w:hanging="360"/>
+      </w:pPr>
+      <w:rPr>
+        <w:rFonts w:ascii="Wingdings" w:hAnsi="Wingdings" w:hint="default"/>
+      </w:rPr>
+    </w:lvl>
+    <w:lvl w:ilvl="3" w:tplc="04160001" w:tentative="1">
+      <w:start w:val="1"/>
+      <w:numFmt w:val="bullet"/>
+      <w:lvlText w:val=""/>
+      <w:lvlJc w:val="left"/>
+      <w:pPr>
+        <w:ind w:left="2880" w:hanging="360"/>
+      </w:pPr>
+      <w:rPr>
+        <w:rFonts w:ascii="Symbol" w:hAnsi="Symbol" w:hint="default"/>
+      </w:rPr>
+    </w:lvl>
+    <w:lvl w:ilvl="4" w:tplc="04160003" w:tentative="1">
+      <w:start w:val="1"/>
+      <w:numFmt w:val="bullet"/>
+      <w:lvlText w:val="o"/>
+      <w:lvlJc w:val="left"/>
+      <w:pPr>
+        <w:ind w:left="3600" w:hanging="360"/>
+      </w:pPr>
+      <w:rPr>
+        <w:rFonts w:ascii="Courier New" w:hAnsi="Courier New" w:cs="Courier New" w:hint="default"/>
+      </w:rPr>
+    </w:lvl>
+    <w:lvl w:ilvl="5" w:tplc="04160005" w:tentative="1">
+      <w:start w:val="1"/>
+      <w:numFmt w:val="bullet"/>
+      <w:lvlText w:val=""/>
+      <w:lvlJc w:val="left"/>
+      <w:pPr>
+        <w:ind w:left="4320" w:hanging="360"/>
+      </w:pPr>
+      <w:rPr>
+        <w:rFonts w:ascii="Wingdings" w:hAnsi="Wingdings" w:hint="default"/>
+      </w:rPr>
+    </w:lvl>
+    <w:lvl w:ilvl="6" w:tplc="04160001" w:tentative="1">
+      <w:start w:val="1"/>
+      <w:numFmt w:val="bullet"/>
+      <w:lvlText w:val=""/>
+      <w:lvlJc w:val="left"/>
+      <w:pPr>
+        <w:ind w:left="5040" w:hanging="360"/>
+      </w:pPr>
+      <w:rPr>
+        <w:rFonts w:ascii="Symbol" w:hAnsi="Symbol" w:hint="default"/>
+      </w:rPr>
+    </w:lvl>
+    <w:lvl w:ilvl="7" w:tplc="04160003" w:tentative="1">
+      <w:start w:val="1"/>
+      <w:numFmt w:val="bullet"/>
+      <w:lvlText w:val="o"/>
+      <w:lvlJc w:val="left"/>
+      <w:pPr>
+        <w:ind w:left="5760" w:hanging="360"/>
+      </w:pPr>
+      <w:rPr>
+        <w:rFonts w:ascii="Courier New" w:hAnsi="Courier New" w:cs="Courier New" w:hint="default"/>
+      </w:rPr>
+    </w:lvl>
+    <w:lvl w:ilvl="8" w:tplc="04160005" w:tentative="1">
+      <w:start w:val="1"/>
+      <w:numFmt w:val="bullet"/>
+      <w:lvlText w:val=""/>
+      <w:lvlJc w:val="left"/>
+      <w:pPr>
+        <w:ind w:left="6480" w:hanging="360"/>
+      </w:pPr>
+      <w:rPr>
+        <w:rFonts w:ascii="Wingdings" w:hAnsi="Wingdings" w:hint="default"/>
+      </w:rPr>
+    </w:lvl>
+  </w:abstractNum>
+  <w:abstractNum w:abstractNumId="16" w15:restartNumberingAfterBreak="0">
     <w:nsid w:val="686B1BCE"/>
     <w:multiLevelType w:val="hybridMultilevel"/>
     <w:tmpl w:val="AAE81FDE"/>
+    <w:lvl w:ilvl="0" w:tplc="04160001">
+      <w:start w:val="1"/>
+      <w:numFmt w:val="bullet"/>
+      <w:lvlText w:val=""/>
+      <w:lvlJc w:val="left"/>
+      <w:pPr>
+        <w:ind w:left="1429" w:hanging="360"/>
+      </w:pPr>
+      <w:rPr>
+        <w:rFonts w:ascii="Symbol" w:hAnsi="Symbol" w:hint="default"/>
+      </w:rPr>
+    </w:lvl>
+    <w:lvl w:ilvl="1" w:tplc="04160003" w:tentative="1">
+      <w:start w:val="1"/>
+      <w:numFmt w:val="bullet"/>
+      <w:lvlText w:val="o"/>
+      <w:lvlJc w:val="left"/>
+      <w:pPr>
+        <w:ind w:left="2149" w:hanging="360"/>
+      </w:pPr>
+      <w:rPr>
+        <w:rFonts w:ascii="Courier New" w:hAnsi="Courier New" w:cs="Courier New" w:hint="default"/>
+      </w:rPr>
+    </w:lvl>
+    <w:lvl w:ilvl="2" w:tplc="04160005" w:tentative="1">
+      <w:start w:val="1"/>
+      <w:numFmt w:val="bullet"/>
+      <w:lvlText w:val=""/>
+      <w:lvlJc w:val="left"/>
+      <w:pPr>
+        <w:ind w:left="2869" w:hanging="360"/>
+      </w:pPr>
+      <w:rPr>
+        <w:rFonts w:ascii="Wingdings" w:hAnsi="Wingdings" w:hint="default"/>
+      </w:rPr>
+    </w:lvl>
+    <w:lvl w:ilvl="3" w:tplc="04160001" w:tentative="1">
+      <w:start w:val="1"/>
+      <w:numFmt w:val="bullet"/>
+      <w:lvlText w:val=""/>
+      <w:lvlJc w:val="left"/>
+      <w:pPr>
+        <w:ind w:left="3589" w:hanging="360"/>
+      </w:pPr>
+      <w:rPr>
+        <w:rFonts w:ascii="Symbol" w:hAnsi="Symbol" w:hint="default"/>
+      </w:rPr>
+    </w:lvl>
+    <w:lvl w:ilvl="4" w:tplc="04160003" w:tentative="1">
+      <w:start w:val="1"/>
+      <w:numFmt w:val="bullet"/>
+      <w:lvlText w:val="o"/>
+      <w:lvlJc w:val="left"/>
+      <w:pPr>
+        <w:ind w:left="4309" w:hanging="360"/>
+      </w:pPr>
+      <w:rPr>
+        <w:rFonts w:ascii="Courier New" w:hAnsi="Courier New" w:cs="Courier New" w:hint="default"/>
+      </w:rPr>
+    </w:lvl>
+    <w:lvl w:ilvl="5" w:tplc="04160005" w:tentative="1">
+      <w:start w:val="1"/>
+      <w:numFmt w:val="bullet"/>
+      <w:lvlText w:val=""/>
+      <w:lvlJc w:val="left"/>
+      <w:pPr>
+        <w:ind w:left="5029" w:hanging="360"/>
+      </w:pPr>
+      <w:rPr>
+        <w:rFonts w:ascii="Wingdings" w:hAnsi="Wingdings" w:hint="default"/>
+      </w:rPr>
+    </w:lvl>
+    <w:lvl w:ilvl="6" w:tplc="04160001" w:tentative="1">
+      <w:start w:val="1"/>
+      <w:numFmt w:val="bullet"/>
+      <w:lvlText w:val=""/>
+      <w:lvlJc w:val="left"/>
+      <w:pPr>
+        <w:ind w:left="5749" w:hanging="360"/>
+      </w:pPr>
+      <w:rPr>
+        <w:rFonts w:ascii="Symbol" w:hAnsi="Symbol" w:hint="default"/>
+      </w:rPr>
+    </w:lvl>
+    <w:lvl w:ilvl="7" w:tplc="04160003" w:tentative="1">
+      <w:start w:val="1"/>
+      <w:numFmt w:val="bullet"/>
+      <w:lvlText w:val="o"/>
+      <w:lvlJc w:val="left"/>
+      <w:pPr>
+        <w:ind w:left="6469" w:hanging="360"/>
+      </w:pPr>
+      <w:rPr>
+        <w:rFonts w:ascii="Courier New" w:hAnsi="Courier New" w:cs="Courier New" w:hint="default"/>
+      </w:rPr>
+    </w:lvl>
+    <w:lvl w:ilvl="8" w:tplc="04160005" w:tentative="1">
+      <w:start w:val="1"/>
+      <w:numFmt w:val="bullet"/>
+      <w:lvlText w:val=""/>
+      <w:lvlJc w:val="left"/>
+      <w:pPr>
+        <w:ind w:left="7189" w:hanging="360"/>
+      </w:pPr>
+      <w:rPr>
+        <w:rFonts w:ascii="Wingdings" w:hAnsi="Wingdings" w:hint="default"/>
+      </w:rPr>
+    </w:lvl>
+  </w:abstractNum>
+  <w:abstractNum w:abstractNumId="17" w15:restartNumberingAfterBreak="0">
+    <w:nsid w:val="69F0690B"/>
+    <w:multiLevelType w:val="hybridMultilevel"/>
+    <w:tmpl w:val="25FECC7C"/>
     <w:lvl w:ilvl="0" w:tplc="04160001">
       <w:start w:val="1"/>
       <w:numFmt w:val="bullet"/>
@@ -3694,7 +4597,7 @@
     <w:abstractNumId w:val="6"/>
   </w:num>
   <w:num w:numId="13">
-    <w:abstractNumId w:val="15"/>
+    <w:abstractNumId w:val="16"/>
   </w:num>
   <w:num w:numId="14">
     <w:abstractNumId w:val="10"/>
@@ -3704,6 +4607,12 @@
   </w:num>
   <w:num w:numId="16">
     <w:abstractNumId w:val="7"/>
+  </w:num>
+  <w:num w:numId="17">
+    <w:abstractNumId w:val="15"/>
+  </w:num>
+  <w:num w:numId="18">
+    <w:abstractNumId w:val="17"/>
   </w:num>
   <w:numIdMacAtCleanup w:val="7"/>
 </w:numbering>

</xml_diff>

<commit_message>
Marcação da seção 1.2
</commit_message>
<xml_diff>
--- a/doc/technical_report.docx
+++ b/doc/technical_report.docx
@@ -1692,26 +1692,47 @@
     </w:p>
     <w:p>
       <w:r>
+        <w:rPr>
+          <w:highlight w:val="yellow"/>
+        </w:rPr>
         <w:t xml:space="preserve">O objetivo deste projeto </w:t>
       </w:r>
       <w:r>
+        <w:rPr>
+          <w:highlight w:val="yellow"/>
+        </w:rPr>
         <w:t xml:space="preserve">é desenvolver um sistema web que interaja com um conjunto de ferramentas de teste, tais como o </w:t>
       </w:r>
       <w:proofErr w:type="spellStart"/>
       <w:r>
+        <w:rPr>
+          <w:highlight w:val="yellow"/>
+        </w:rPr>
         <w:t>Selenium</w:t>
       </w:r>
       <w:proofErr w:type="spellEnd"/>
       <w:r>
+        <w:rPr>
+          <w:highlight w:val="yellow"/>
+        </w:rPr>
         <w:t xml:space="preserve"> Web Driver e o </w:t>
       </w:r>
       <w:proofErr w:type="spellStart"/>
       <w:r>
+        <w:rPr>
+          <w:highlight w:val="yellow"/>
+        </w:rPr>
         <w:t>JUnit</w:t>
       </w:r>
       <w:proofErr w:type="spellEnd"/>
       <w:r>
-        <w:t xml:space="preserve"> 5, de modo a automatizar a execução de testes em sistemas web, sejam esses sistemas compostos por APIs ou interfaces com o usuário tais como páginas contendo formulários. </w:t>
+        <w:rPr>
+          <w:highlight w:val="yellow"/>
+        </w:rPr>
+        <w:t xml:space="preserve"> 5, de modo a automatizar a execução de testes em sistemas web, sejam esses sistemas compostos por APIs ou interfaces com o usuário tais como páginas contendo formulários.</w:t>
+      </w:r>
+      <w:r>
+        <w:t xml:space="preserve"> </w:t>
       </w:r>
     </w:p>
     <w:p>
@@ -1720,7 +1741,21 @@
           <w:highlight w:val="yellow"/>
         </w:rPr>
         <w:lastRenderedPageBreak/>
-        <w:t>Além disso, o sistema a ser desenvolvido deverá ser capaz de gerenciar os casos de teste de modo  a permitir sua reutilização em sistemas similares.</w:t>
+        <w:t xml:space="preserve">Além disso, o sistema a ser desenvolvido deverá ser capaz de gerenciar os casos de teste de </w:t>
+      </w:r>
+      <w:proofErr w:type="gramStart"/>
+      <w:r>
+        <w:rPr>
+          <w:highlight w:val="yellow"/>
+        </w:rPr>
+        <w:t>modo  a</w:t>
+      </w:r>
+      <w:proofErr w:type="gramEnd"/>
+      <w:r>
+        <w:rPr>
+          <w:highlight w:val="yellow"/>
+        </w:rPr>
+        <w:t xml:space="preserve"> permitir sua reutilização em sistemas similares.</w:t>
       </w:r>
     </w:p>
     <w:p>
@@ -2545,17 +2580,17 @@
         <v:path o:extrusionok="f" gradientshapeok="t" o:connecttype="rect"/>
         <o:lock v:ext="edit" aspectratio="t"/>
       </v:shapetype>
-      <v:shape id="_x0000_i1479" type="#_x0000_t75" style="width:3in;height:3in" o:bullet="t"/>
+      <v:shape id="_x0000_i1482" type="#_x0000_t75" style="width:3in;height:3in" o:bullet="t"/>
     </w:pict>
   </w:numPicBullet>
   <w:numPicBullet w:numPicBulletId="1">
     <w:pict>
-      <v:shape id="_x0000_i1480" type="#_x0000_t75" style="width:3in;height:3in" o:bullet="t"/>
+      <v:shape id="_x0000_i1483" type="#_x0000_t75" style="width:3in;height:3in" o:bullet="t"/>
     </w:pict>
   </w:numPicBullet>
   <w:numPicBullet w:numPicBulletId="2">
     <w:pict>
-      <v:shape id="_x0000_i1481" type="#_x0000_t75" style="width:3in;height:3in" o:bullet="t"/>
+      <v:shape id="_x0000_i1484" type="#_x0000_t75" style="width:3in;height:3in" o:bullet="t"/>
     </w:pict>
   </w:numPicBullet>
   <w:abstractNum w:abstractNumId="0" w15:restartNumberingAfterBreak="0">

</xml_diff>